<commit_message>
feat(reporting): overhaul PDF export styling, progress indicators, and AI reporting pipeline
</commit_message>
<xml_diff>
--- a/samples/templates/ULA-Master-Report.docx
+++ b/samples/templates/ULA-Master-Report.docx
@@ -4,13 +4,13 @@
   <w:body>
     <w:p>
       <w:pPr>
-        <w:spacing w:after="280"/>
+        <w:spacing w:after="220" w:before="360"/>
         <w:jc w:val="center"/>
       </w:pPr>
       <w:r>
         <w:drawing>
           <wp:inline distT="0" distB="0" distL="0" distR="0">
-            <wp:extent cx="1600200" cy="1600200"/>
+            <wp:extent cx="1409700" cy="1409700"/>
             <wp:effectExtent t="0" r="0" b="0" l="0"/>
             <wp:docPr id="1" name="" descr="" title=""/>
             <wp:cNvGraphicFramePr>
@@ -35,7 +35,7 @@
                   <pic:spPr bwMode="auto">
                     <a:xfrm>
                       <a:off x="0" y="0"/>
-                      <a:ext cx="1600200" cy="1600200"/>
+                      <a:ext cx="1409700" cy="1409700"/>
                     </a:xfrm>
                     <a:prstGeom prst="rect">
                       <a:avLst/>
@@ -50,7 +50,25 @@
     </w:p>
     <w:p>
       <w:pPr>
+        <w:spacing w:after="80"/>
+        <w:jc w:val="center"/>
+      </w:pPr>
+      <w:r>
+        <w:rPr>
+          <w:rFonts w:ascii="Aptos" w:cs="Aptos" w:eastAsia="Aptos" w:hAnsi="Aptos"/>
+          <w:b/>
+          <w:bCs/>
+          <w:color w:val="1F8A79"/>
+          <w:sz w:val="17"/>
+          <w:szCs w:val="17"/>
+        </w:rPr>
+        <w:t xml:space="preserve">UNITED LOSS ADJUSTERS &amp; SURVEYORS</w:t>
+      </w:r>
+    </w:p>
+    <w:p>
+      <w:pPr>
         <w:pStyle w:val="Title"/>
+        <w:spacing w:after="130" w:before="420"/>
         <w:jc w:val="center"/>
       </w:pPr>
       <w:r>
@@ -59,14 +77,15 @@
           <w:b/>
           <w:bCs/>
           <w:color w:val="17211F"/>
-          <w:sz w:val="46"/>
-          <w:szCs w:val="46"/>
+          <w:sz w:val="48"/>
+          <w:szCs w:val="48"/>
         </w:rPr>
         <w:t xml:space="preserve">General Claim Report</w:t>
       </w:r>
     </w:p>
     <w:p>
       <w:pPr>
+        <w:spacing w:after="360"/>
         <w:jc w:val="center"/>
       </w:pPr>
       <w:r>
@@ -80,42 +99,6 @@
         </w:rPr>
         <w:t xml:space="preserve">{{report_issue_state}} REPORT</w:t>
       </w:r>
-    </w:p>
-    <w:p>
-      <w:pPr>
-        <w:spacing w:before="500"/>
-        <w:jc w:val="center"/>
-      </w:pPr>
-      <w:r>
-        <w:rPr>
-          <w:rFonts w:ascii="Aptos" w:cs="Aptos" w:eastAsia="Aptos" w:hAnsi="Aptos"/>
-          <w:b/>
-          <w:bCs/>
-          <w:color w:val="17211F"/>
-          <w:sz w:val="30"/>
-          <w:szCs w:val="30"/>
-        </w:rPr>
-        <w:t xml:space="preserve">{{insured_name}}</w:t>
-      </w:r>
-    </w:p>
-    <w:p>
-      <w:pPr>
-        <w:jc w:val="center"/>
-      </w:pPr>
-      <w:r>
-        <w:rPr>
-          <w:rFonts w:ascii="Aptos" w:cs="Aptos" w:eastAsia="Aptos" w:hAnsi="Aptos"/>
-          <w:color w:val="17211F"/>
-          <w:sz w:val="24"/>
-          <w:szCs w:val="24"/>
-        </w:rPr>
-        <w:t xml:space="preserve">{{loss_or_interest_description}}</w:t>
-      </w:r>
-    </w:p>
-    <w:p>
-      <w:pPr>
-        <w:spacing w:before="500"/>
-      </w:pPr>
     </w:p>
     <w:tbl>
       <w:tblPr>
@@ -161,7 +144,7 @@
                 <w:sz w:val="18"/>
                 <w:szCs w:val="18"/>
               </w:rPr>
-              <w:t xml:space="preserve">ULA Reference</w:t>
+              <w:t xml:space="preserve">INSURED</w:t>
             </w:r>
           </w:p>
         </w:tc>
@@ -189,7 +172,7 @@
                 <w:sz w:val="19"/>
                 <w:szCs w:val="19"/>
               </w:rPr>
-              <w:t xml:space="preserve">{{claim_number}}</w:t>
+              <w:t xml:space="preserve">{{insured_name}}</w:t>
             </w:r>
           </w:p>
         </w:tc>
@@ -222,7 +205,7 @@
                 <w:sz w:val="18"/>
                 <w:szCs w:val="18"/>
               </w:rPr>
-              <w:t xml:space="preserve">Policy</w:t>
+              <w:t xml:space="preserve">INSURER</w:t>
             </w:r>
           </w:p>
         </w:tc>
@@ -250,7 +233,7 @@
                 <w:sz w:val="19"/>
                 <w:szCs w:val="19"/>
               </w:rPr>
-              <w:t xml:space="preserve">{{policy_number}}</w:t>
+              <w:t xml:space="preserve">{{insurer}}</w:t>
             </w:r>
           </w:p>
         </w:tc>
@@ -283,7 +266,7 @@
                 <w:sz w:val="18"/>
                 <w:szCs w:val="18"/>
               </w:rPr>
-              <w:t xml:space="preserve">Date of Loss</w:t>
+              <w:t xml:space="preserve">ULA REFERENCE</w:t>
             </w:r>
           </w:p>
         </w:tc>
@@ -311,74 +294,16 @@
                 <w:sz w:val="19"/>
                 <w:szCs w:val="19"/>
               </w:rPr>
-              <w:t xml:space="preserve">{{date_of_loss}}</w:t>
-            </w:r>
-          </w:p>
-        </w:tc>
-      </w:tr>
-      <w:tr>
-        <w:tc>
-          <w:tcPr>
-            <w:tcW w:type="pct" w:w="28%"/>
-            <w:tcBorders>
-              <w:top w:val="single" w:color="B9C2BE" w:sz="4"/>
-              <w:left w:val="single" w:color="B9C2BE" w:sz="4"/>
-              <w:bottom w:val="single" w:color="B9C2BE" w:sz="4"/>
-              <w:right w:val="single" w:color="B9C2BE" w:sz="4"/>
-            </w:tcBorders>
-            <w:shd w:fill="F3F5F2"/>
-            <w:tcMar>
-              <w:top w:type="dxa" w:w="100"/>
-              <w:left w:type="dxa" w:w="120"/>
-              <w:bottom w:type="dxa" w:w="100"/>
-              <w:right w:type="dxa" w:w="120"/>
-            </w:tcMar>
-          </w:tcPr>
-          <w:p>
-            <w:r>
-              <w:rPr>
-                <w:rFonts w:ascii="Aptos" w:cs="Aptos" w:eastAsia="Aptos" w:hAnsi="Aptos"/>
-                <w:b/>
-                <w:bCs/>
-                <w:color w:val="17211F"/>
-                <w:sz w:val="18"/>
-                <w:szCs w:val="18"/>
-              </w:rPr>
-              <w:t xml:space="preserve">Date of Issue</w:t>
-            </w:r>
-          </w:p>
-        </w:tc>
-        <w:tc>
-          <w:tcPr>
-            <w:tcW w:type="pct" w:w="72%"/>
-            <w:tcBorders>
-              <w:top w:val="single" w:color="B9C2BE" w:sz="4"/>
-              <w:left w:val="single" w:color="B9C2BE" w:sz="4"/>
-              <w:bottom w:val="single" w:color="B9C2BE" w:sz="4"/>
-              <w:right w:val="single" w:color="B9C2BE" w:sz="4"/>
-            </w:tcBorders>
-            <w:tcMar>
-              <w:top w:type="dxa" w:w="100"/>
-              <w:left w:type="dxa" w:w="120"/>
-              <w:bottom w:type="dxa" w:w="100"/>
-              <w:right w:type="dxa" w:w="120"/>
-            </w:tcMar>
-          </w:tcPr>
-          <w:p>
-            <w:r>
-              <w:rPr>
-                <w:rFonts w:ascii="Aptos" w:cs="Aptos" w:eastAsia="Aptos" w:hAnsi="Aptos"/>
-                <w:color w:val="17211F"/>
-                <w:sz w:val="19"/>
-                <w:szCs w:val="19"/>
-              </w:rPr>
-              <w:t xml:space="preserve">{{issue_date}}</w:t>
+              <w:t xml:space="preserve">{{claim_number}}</w:t>
             </w:r>
           </w:p>
         </w:tc>
       </w:tr>
     </w:tbl>
     <w:p>
+      <w:pPr>
+        <w:spacing w:before="260"/>
+      </w:pPr>
       <w:r>
         <w:br w:type="page"/>
       </w:r>
@@ -1907,6 +1832,182 @@
         <w:t xml:space="preserve">{{corporate}}</w:t>
       </w:r>
     </w:p>
+    <w:p>
+      <w:r>
+        <w:br w:type="page"/>
+      </w:r>
+    </w:p>
+    <w:tbl>
+      <w:tblPr>
+        <w:tblW w:type="pct" w:w="100%"/>
+        <w:tblBorders>
+          <w:top w:val="single" w:color="auto" w:sz="4"/>
+          <w:left w:val="single" w:color="auto" w:sz="4"/>
+          <w:bottom w:val="single" w:color="auto" w:sz="4"/>
+          <w:right w:val="single" w:color="auto" w:sz="4"/>
+          <w:insideH w:val="single" w:color="auto" w:sz="4"/>
+          <w:insideV w:val="single" w:color="auto" w:sz="4"/>
+        </w:tblBorders>
+      </w:tblPr>
+      <w:tblGrid>
+        <w:gridCol w:w="100"/>
+      </w:tblGrid>
+      <w:tr>
+        <w:tc>
+          <w:tcPr>
+            <w:tcBorders>
+              <w:top w:val="single" w:color="1F8A79" w:sz="10"/>
+              <w:left w:val="single" w:color="1F8A79" w:sz="10"/>
+              <w:bottom w:val="single" w:color="1F8A79" w:sz="10"/>
+              <w:right w:val="single" w:color="1F8A79" w:sz="10"/>
+            </w:tcBorders>
+            <w:shd w:fill="1F8A79"/>
+            <w:tcMar>
+              <w:top w:type="dxa" w:w="420"/>
+              <w:left w:type="dxa" w:w="420"/>
+              <w:bottom w:type="dxa" w:w="420"/>
+              <w:right w:type="dxa" w:w="420"/>
+            </w:tcMar>
+          </w:tcPr>
+          <w:p>
+            <w:pPr>
+              <w:jc w:val="center"/>
+            </w:pPr>
+            <w:r>
+              <w:drawing>
+                <wp:inline distT="0" distB="0" distL="0" distR="0">
+                  <wp:extent cx="2571750" cy="2571750"/>
+                  <wp:effectExtent t="0" r="0" b="0" l="0"/>
+                  <wp:docPr id="1" name="" descr="" title=""/>
+                  <wp:cNvGraphicFramePr>
+                    <a:graphicFrameLocks xmlns:a="http://schemas.openxmlformats.org/drawingml/2006/main" noChangeAspect="1"/>
+                  </wp:cNvGraphicFramePr>
+                  <a:graphic xmlns:a="http://schemas.openxmlformats.org/drawingml/2006/main">
+                    <a:graphicData uri="http://schemas.openxmlformats.org/drawingml/2006/picture">
+                      <pic:pic xmlns:pic="http://schemas.openxmlformats.org/drawingml/2006/picture">
+                        <pic:nvPicPr>
+                          <pic:cNvPr id="0" name="" descr=""/>
+                          <pic:cNvPicPr>
+                            <a:picLocks noChangeAspect="1" noChangeArrowheads="1"/>
+                          </pic:cNvPicPr>
+                        </pic:nvPicPr>
+                        <pic:blipFill>
+                          <a:blip r:embed="rId9" cstate="none"/>
+                          <a:srcRect/>
+                          <a:stretch>
+                            <a:fillRect/>
+                          </a:stretch>
+                        </pic:blipFill>
+                        <pic:spPr bwMode="auto">
+                          <a:xfrm>
+                            <a:off x="0" y="0"/>
+                            <a:ext cx="2571750" cy="2571750"/>
+                          </a:xfrm>
+                          <a:prstGeom prst="rect">
+                            <a:avLst/>
+                          </a:prstGeom>
+                        </pic:spPr>
+                      </pic:pic>
+                    </a:graphicData>
+                  </a:graphic>
+                </wp:inline>
+              </w:drawing>
+            </w:r>
+          </w:p>
+          <w:p>
+            <w:pPr>
+              <w:spacing w:after="90" w:before="180"/>
+              <w:jc w:val="center"/>
+            </w:pPr>
+            <w:r>
+              <w:drawing>
+                <wp:inline distT="0" distB="0" distL="0" distR="0">
+                  <wp:extent cx="819150" cy="819150"/>
+                  <wp:effectExtent t="0" r="0" b="0" l="0"/>
+                  <wp:docPr id="1" name="" descr="" title=""/>
+                  <wp:cNvGraphicFramePr>
+                    <a:graphicFrameLocks xmlns:a="http://schemas.openxmlformats.org/drawingml/2006/main" noChangeAspect="1"/>
+                  </wp:cNvGraphicFramePr>
+                  <a:graphic xmlns:a="http://schemas.openxmlformats.org/drawingml/2006/main">
+                    <a:graphicData uri="http://schemas.openxmlformats.org/drawingml/2006/picture">
+                      <pic:pic xmlns:pic="http://schemas.openxmlformats.org/drawingml/2006/picture">
+                        <pic:nvPicPr>
+                          <pic:cNvPr id="0" name="" descr=""/>
+                          <pic:cNvPicPr>
+                            <a:picLocks noChangeAspect="1" noChangeArrowheads="1"/>
+                          </pic:cNvPicPr>
+                        </pic:nvPicPr>
+                        <pic:blipFill>
+                          <a:blip r:embed="rId8" cstate="none"/>
+                          <a:srcRect/>
+                          <a:stretch>
+                            <a:fillRect/>
+                          </a:stretch>
+                        </pic:blipFill>
+                        <pic:spPr bwMode="auto">
+                          <a:xfrm>
+                            <a:off x="0" y="0"/>
+                            <a:ext cx="819150" cy="819150"/>
+                          </a:xfrm>
+                          <a:prstGeom prst="rect">
+                            <a:avLst/>
+                          </a:prstGeom>
+                        </pic:spPr>
+                      </pic:pic>
+                    </a:graphicData>
+                  </a:graphic>
+                </wp:inline>
+              </w:drawing>
+            </w:r>
+          </w:p>
+          <w:p>
+            <w:pPr>
+              <w:jc w:val="center"/>
+            </w:pPr>
+            <w:r>
+              <w:rPr>
+                <w:rFonts w:ascii="Aptos" w:cs="Aptos" w:eastAsia="Aptos" w:hAnsi="Aptos"/>
+                <w:b/>
+                <w:bCs/>
+                <w:color w:val="FFFFFF"/>
+                <w:sz w:val="20"/>
+                <w:szCs w:val="20"/>
+              </w:rPr>
+              <w:t xml:space="preserve">UNITED LOSS ADJUSTERS &amp; SURVEYORS</w:t>
+            </w:r>
+          </w:p>
+          <w:p>
+            <w:pPr>
+              <w:spacing w:after="180" w:before="130"/>
+              <w:jc w:val="center"/>
+            </w:pPr>
+            <w:r>
+              <w:rPr>
+                <w:rFonts w:ascii="Aptos" w:cs="Aptos" w:eastAsia="Aptos" w:hAnsi="Aptos"/>
+                <w:color w:val="FFFFFF"/>
+                <w:sz w:val="16"/>
+                <w:szCs w:val="16"/>
+              </w:rPr>
+              <w:t xml:space="preserve">Independent loss adjusting, surveying and claims consultancy</w:t>
+            </w:r>
+          </w:p>
+          <w:p>
+            <w:pPr>
+              <w:jc w:val="center"/>
+            </w:pPr>
+            <w:r>
+              <w:rPr>
+                <w:rFonts w:ascii="Aptos" w:cs="Aptos" w:eastAsia="Aptos" w:hAnsi="Aptos"/>
+                <w:color w:val="FFFFFF"/>
+                <w:sz w:val="15"/>
+                <w:szCs w:val="15"/>
+              </w:rPr>
+              <w:t xml:space="preserve">This controlled report is issued subject to ULA's agreed terms, conditions and professional review requirements.</w:t>
+            </w:r>
+          </w:p>
+        </w:tc>
+      </w:tr>
+    </w:tbl>
     <w:sectPr>
       <w:footerReference w:type="default" r:id="rId7"/>
       <w:pgSz w:w="11906" w:h="16838" w:orient="portrait"/>

</xml_diff>